<commit_message>
Add second author metadata to manuscript package
</commit_message>
<xml_diff>
--- a/manuscript/submission/cover-letter.docx
+++ b/manuscript/submission/cover-letter.docx
@@ -117,22 +117,22 @@
     <w:p/>
     <w:p>
       <w:r>
-        <w:t>This submission is original, has not been published or submitted elsewhere,</w:t>
+        <w:t>This submission is original and has not been published or submitted elsewhere</w:t>
       </w:r>
     </w:p>
     <w:p>
       <w:r>
-        <w:t>and is approved by all authors. All authors agree to take responsibility for</w:t>
+        <w:t>[TO CONFIRM]. All authors approve the final manuscript and agree to take</w:t>
       </w:r>
     </w:p>
     <w:p>
       <w:r>
-        <w:t>the work and to disclose any relevant conflicts and funding in the final</w:t>
+        <w:t>responsibility for the work [TO CONFIRM]. Relevant conflicts and funding are</w:t>
       </w:r>
     </w:p>
     <w:p>
       <w:r>
-        <w:t>submission materials.</w:t>
+        <w:t>disclosed in the submission materials.</w:t>
       </w:r>
     </w:p>
     <w:p/>
@@ -185,7 +185,18 @@
     </w:p>
     <w:p>
       <w:r>
-        <w:t>[INSTITUTIONAL EMAIL]</w:t>
+        <w:t>dan@terpedia.com</w:t>
+      </w:r>
+    </w:p>
+    <w:p/>
+    <w:p>
+      <w:r>
+        <w:t>Susan Trapp’s affiliation, contact information, ORCID, competing interests,</w:t>
+      </w:r>
+    </w:p>
+    <w:p>
+      <w:r>
+        <w:t>and final contribution confirmation remain [TO CONFIRM].</w:t>
       </w:r>
     </w:p>
     <w:sectPr>

</xml_diff>